<commit_message>
paper: perbarui figur, style, dan output proposal TILIK
</commit_message>
<xml_diff>
--- a/paper/output/TILIK_Proposal_IRIS-Heisenberg.docx
+++ b/paper/output/TILIK_Proposal_IRIS-Heisenberg.docx
@@ -69,9 +69,8 @@
               <w:rPr>
                 <w:i/>
                 <w:sz w:val="20"/>
-                <w:highlight w:val="yellow"/>
-              </w:rPr>
-              <w:t>[ISI: departemen / program studi]</w:t>
+              </w:rPr>
+              <w:t>Program Studi Teknologi Sains Data</w:t>
             </w:r>
             <w:r>
               <w:br/>
@@ -79,9 +78,8 @@
             <w:r>
               <w:rPr>
                 <w:sz w:val="20"/>
-                <w:highlight w:val="yellow"/>
-              </w:rPr>
-              <w:t>[ISI: universitas]</w:t>
+              </w:rPr>
+              <w:t>Universitas Airlangga</w:t>
             </w:r>
             <w:r>
               <w:br/>
@@ -89,25 +87,17 @@
             <w:r>
               <w:rPr>
                 <w:sz w:val="20"/>
-                <w:highlight w:val="yellow"/>
-              </w:rPr>
-              <w:t>[ISI: kota]</w:t>
+              </w:rPr>
+              <w:t>Surabaya, Indonesia</w:t>
+            </w:r>
+            <w:r>
+              <w:br/>
             </w:r>
             <w:r>
               <w:rPr>
                 <w:sz w:val="20"/>
               </w:rPr>
-              <w:t>, Indonesia</w:t>
-            </w:r>
-            <w:r>
-              <w:br/>
-            </w:r>
-            <w:r>
-              <w:rPr>
-                <w:sz w:val="20"/>
-                <w:highlight w:val="yellow"/>
-              </w:rPr>
-              <w:t>[ISI: email]</w:t>
+              <w:t>timotiuspatrick@gmail.com</w:t>
             </w:r>
           </w:p>
         </w:tc>
@@ -130,9 +120,8 @@
               <w:rPr>
                 <w:i/>
                 <w:sz w:val="20"/>
-                <w:highlight w:val="yellow"/>
-              </w:rPr>
-              <w:t>[ISI: departemen / program studi]</w:t>
+              </w:rPr>
+              <w:t>Program Studi Teknologi Sains Data</w:t>
             </w:r>
             <w:r>
               <w:br/>
@@ -140,9 +129,8 @@
             <w:r>
               <w:rPr>
                 <w:sz w:val="20"/>
-                <w:highlight w:val="yellow"/>
-              </w:rPr>
-              <w:t>[ISI: universitas]</w:t>
+              </w:rPr>
+              <w:t>Universitas Airlangga</w:t>
             </w:r>
             <w:r>
               <w:br/>
@@ -150,25 +138,17 @@
             <w:r>
               <w:rPr>
                 <w:sz w:val="20"/>
-                <w:highlight w:val="yellow"/>
-              </w:rPr>
-              <w:t>[ISI: kota]</w:t>
+              </w:rPr>
+              <w:t>Surabaya, Indonesia</w:t>
+            </w:r>
+            <w:r>
+              <w:br/>
             </w:r>
             <w:r>
               <w:rPr>
                 <w:sz w:val="20"/>
               </w:rPr>
-              <w:t>, Indonesia</w:t>
-            </w:r>
-            <w:r>
-              <w:br/>
-            </w:r>
-            <w:r>
-              <w:rPr>
-                <w:sz w:val="20"/>
-                <w:highlight w:val="yellow"/>
-              </w:rPr>
-              <w:t>[ISI: email]</w:t>
+              <w:t>raphael.adikara@gmail.com</w:t>
             </w:r>
           </w:p>
         </w:tc>
@@ -193,9 +173,8 @@
               <w:rPr>
                 <w:i/>
                 <w:sz w:val="20"/>
-                <w:highlight w:val="yellow"/>
-              </w:rPr>
-              <w:t>[ISI: departemen / program studi]</w:t>
+              </w:rPr>
+              <w:t>Program Studi Sains Data, Departemen Statistika</w:t>
             </w:r>
             <w:r>
               <w:br/>
@@ -203,9 +182,8 @@
             <w:r>
               <w:rPr>
                 <w:sz w:val="20"/>
-                <w:highlight w:val="yellow"/>
-              </w:rPr>
-              <w:t>[ISI: universitas]</w:t>
+              </w:rPr>
+              <w:t>Universitas Brawijaya</w:t>
             </w:r>
             <w:r>
               <w:br/>
@@ -213,25 +191,17 @@
             <w:r>
               <w:rPr>
                 <w:sz w:val="20"/>
-                <w:highlight w:val="yellow"/>
-              </w:rPr>
-              <w:t>[ISI: kota]</w:t>
+              </w:rPr>
+              <w:t>Malang, Indonesia</w:t>
+            </w:r>
+            <w:r>
+              <w:br/>
             </w:r>
             <w:r>
               <w:rPr>
                 <w:sz w:val="20"/>
               </w:rPr>
-              <w:t>, Indonesia</w:t>
-            </w:r>
-            <w:r>
-              <w:br/>
-            </w:r>
-            <w:r>
-              <w:rPr>
-                <w:sz w:val="20"/>
-                <w:highlight w:val="yellow"/>
-              </w:rPr>
-              <w:t>[ISI: email]</w:t>
+              <w:t>mikael.adikara@gmail.com</w:t>
             </w:r>
           </w:p>
         </w:tc>
@@ -254,9 +224,8 @@
               <w:rPr>
                 <w:i/>
                 <w:sz w:val="20"/>
-                <w:highlight w:val="yellow"/>
-              </w:rPr>
-              <w:t>[ISI: departemen / program studi]</w:t>
+              </w:rPr>
+              <w:t>Program Studi Teknologi Sains Data</w:t>
             </w:r>
             <w:r>
               <w:br/>
@@ -264,9 +233,8 @@
             <w:r>
               <w:rPr>
                 <w:sz w:val="20"/>
-                <w:highlight w:val="yellow"/>
-              </w:rPr>
-              <w:t>[ISI: universitas]</w:t>
+              </w:rPr>
+              <w:t>Universitas Airlangga</w:t>
             </w:r>
             <w:r>
               <w:br/>
@@ -274,25 +242,17 @@
             <w:r>
               <w:rPr>
                 <w:sz w:val="20"/>
-                <w:highlight w:val="yellow"/>
-              </w:rPr>
-              <w:t>[ISI: kota]</w:t>
+              </w:rPr>
+              <w:t>Surabaya, Indonesia</w:t>
+            </w:r>
+            <w:r>
+              <w:br/>
             </w:r>
             <w:r>
               <w:rPr>
                 <w:sz w:val="20"/>
               </w:rPr>
-              <w:t>, Indonesia</w:t>
-            </w:r>
-            <w:r>
-              <w:br/>
-            </w:r>
-            <w:r>
-              <w:rPr>
-                <w:sz w:val="20"/>
-                <w:highlight w:val="yellow"/>
-              </w:rPr>
-              <w:t>[ISI: email]</w:t>
+              <w:t>lostar7557@gmail.com</w:t>
             </w:r>
           </w:p>
         </w:tc>
@@ -800,7 +760,7 @@
             <w:r>
               <w:drawing>
                 <wp:inline xmlns:a="http://schemas.openxmlformats.org/drawingml/2006/main" xmlns:pic="http://schemas.openxmlformats.org/drawingml/2006/picture">
-                  <wp:extent cx="6176018" cy="3086374"/>
+                  <wp:extent cx="6176018" cy="3235848"/>
                   <wp:docPr id="1" name="Picture 1"/>
                   <wp:cNvGraphicFramePr>
                     <a:graphicFrameLocks noChangeAspect="1"/>
@@ -821,7 +781,7 @@
                         <pic:spPr>
                           <a:xfrm>
                             <a:off x="0" y="0"/>
-                            <a:ext cx="6176018" cy="3086374"/>
+                            <a:ext cx="6176018" cy="3235848"/>
                           </a:xfrm>
                           <a:prstGeom prst="rect"/>
                         </pic:spPr>
@@ -838,7 +798,7 @@
               <w:spacing w:after="80"/>
             </w:pPr>
             <w:r>
-              <w:t>Data masalah. A: proporsi lansia [4]. B dan C: waktu kedatangan pasien stroke [2], [3]. D: akses teknologi lansia [7] dan kepatuhan obat [6].</w:t>
+              <w:t>Data masalah. (a) Proporsi lansia [4]. (b) dan (c) Waktu kedatangan pasien stroke [2], [3]. (d) Akses teknologi lansia [7] dan kepatuhan obat [6].</w:t>
             </w:r>
           </w:p>
         </w:tc>
@@ -924,7 +884,7 @@
             <w:r>
               <w:drawing>
                 <wp:inline xmlns:a="http://schemas.openxmlformats.org/drawingml/2006/main" xmlns:pic="http://schemas.openxmlformats.org/drawingml/2006/picture">
-                  <wp:extent cx="6176018" cy="1834169"/>
+                  <wp:extent cx="6176018" cy="1548053"/>
                   <wp:docPr id="2" name="Picture 2"/>
                   <wp:cNvGraphicFramePr>
                     <a:graphicFrameLocks noChangeAspect="1"/>
@@ -945,7 +905,7 @@
                         <pic:spPr>
                           <a:xfrm>
                             <a:off x="0" y="0"/>
-                            <a:ext cx="6176018" cy="1834169"/>
+                            <a:ext cx="6176018" cy="1548053"/>
                           </a:xfrm>
                           <a:prstGeom prst="rect"/>
                         </pic:spPr>
@@ -962,7 +922,7 @@
               <w:spacing w:after="80"/>
             </w:pPr>
             <w:r>
-              <w:t>Jalur pasien stroke dari gejala pertama sampai terapi. Tiga langkah pertama terjadi di rumah dan belum memiliki sistem pendukung.</w:t>
+              <w:t>Jalur pasien stroke dari gejala pertama sampai terapi. Tiga langkah pertama (abu-abu) terjadi di rumah dan belum memiliki sistem pendukung [2], [3], [5].</w:t>
             </w:r>
           </w:p>
         </w:tc>
@@ -1551,7 +1511,7 @@
             <w:r>
               <w:drawing>
                 <wp:inline xmlns:a="http://schemas.openxmlformats.org/drawingml/2006/main" xmlns:pic="http://schemas.openxmlformats.org/drawingml/2006/picture">
-                  <wp:extent cx="6176018" cy="2661344"/>
+                  <wp:extent cx="6176018" cy="2351227"/>
                   <wp:docPr id="3" name="Picture 3"/>
                   <wp:cNvGraphicFramePr>
                     <a:graphicFrameLocks noChangeAspect="1"/>
@@ -1572,7 +1532,7 @@
                         <pic:spPr>
                           <a:xfrm>
                             <a:off x="0" y="0"/>
-                            <a:ext cx="6176018" cy="2661344"/>
+                            <a:ext cx="6176018" cy="2351227"/>
                           </a:xfrm>
                           <a:prstGeom prst="rect"/>
                         </pic:spPr>
@@ -2349,7 +2309,7 @@
             <w:r>
               <w:drawing>
                 <wp:inline xmlns:a="http://schemas.openxmlformats.org/drawingml/2006/main" xmlns:pic="http://schemas.openxmlformats.org/drawingml/2006/picture">
-                  <wp:extent cx="6176018" cy="2700577"/>
+                  <wp:extent cx="6176018" cy="2581167"/>
                   <wp:docPr id="4" name="Picture 4"/>
                   <wp:cNvGraphicFramePr>
                     <a:graphicFrameLocks noChangeAspect="1"/>
@@ -2370,7 +2330,7 @@
                         <pic:spPr>
                           <a:xfrm>
                             <a:off x="0" y="0"/>
-                            <a:ext cx="6176018" cy="2700577"/>
+                            <a:ext cx="6176018" cy="2581167"/>
                           </a:xfrm>
                           <a:prstGeom prst="rect"/>
                         </pic:spPr>
@@ -2509,7 +2469,7 @@
             <w:r>
               <w:drawing>
                 <wp:inline xmlns:a="http://schemas.openxmlformats.org/drawingml/2006/main" xmlns:pic="http://schemas.openxmlformats.org/drawingml/2006/picture">
-                  <wp:extent cx="6176018" cy="3030793"/>
+                  <wp:extent cx="6176018" cy="3096106"/>
                   <wp:docPr id="5" name="Picture 5"/>
                   <wp:cNvGraphicFramePr>
                     <a:graphicFrameLocks noChangeAspect="1"/>
@@ -2530,7 +2490,7 @@
                         <pic:spPr>
                           <a:xfrm>
                             <a:off x="0" y="0"/>
-                            <a:ext cx="6176018" cy="3030793"/>
+                            <a:ext cx="6176018" cy="3096106"/>
                           </a:xfrm>
                           <a:prstGeom prst="rect"/>
                         </pic:spPr>
@@ -2547,7 +2507,7 @@
               <w:spacing w:after="80"/>
             </w:pPr>
             <w:r>
-              <w:t>Arsitektur TILIK. Kotak hijau muda adalah kode tim; kotak abu-abu adalah layanan pihak ketiga.</w:t>
+              <w:t>Arsitektur TILIK. Kotak putih adalah kode tim; kotak abu-abu adalah layanan pihak ketiga.</w:t>
             </w:r>
           </w:p>
         </w:tc>
@@ -3079,7 +3039,7 @@
             <w:r>
               <w:drawing>
                 <wp:inline xmlns:a="http://schemas.openxmlformats.org/drawingml/2006/main" xmlns:pic="http://schemas.openxmlformats.org/drawingml/2006/picture">
-                  <wp:extent cx="5790017" cy="2967039"/>
+                  <wp:extent cx="5790017" cy="2778115"/>
                   <wp:docPr id="6" name="Picture 6"/>
                   <wp:cNvGraphicFramePr>
                     <a:graphicFrameLocks noChangeAspect="1"/>
@@ -3100,7 +3060,7 @@
                         <pic:spPr>
                           <a:xfrm>
                             <a:off x="0" y="0"/>
-                            <a:ext cx="5790017" cy="2967039"/>
+                            <a:ext cx="5790017" cy="2778115"/>
                           </a:xfrm>
                           <a:prstGeom prst="rect"/>
                         </pic:spPr>
@@ -3117,7 +3077,7 @@
               <w:spacing w:after="80"/>
             </w:pPr>
             <w:r>
-              <w:t>Rancangan antarmuka: rapor WhatsApp untuk anak (kiri) dan kartu pre-alert di Board IGD (kanan).</w:t>
+              <w:t>Rancangan antarmuka (wireframe, data fiktif): rapor WhatsApp untuk anak (kiri) dan kartu pre-alert di Board IGD (kanan).</w:t>
             </w:r>
           </w:p>
         </w:tc>
@@ -3180,7 +3140,7 @@
         <w:t>E3 (manusia):</w:t>
       </w:r>
       <w:r>
-        <w:t xml:space="preserve"> uji dengan lansia dan review tenaga kesehatan sebelum Grand Final. Pemeriksaan keselamatan memakai aturan deterministik, bukan sekadar penilaian LLM (Tabel V).</w:t>
+        <w:t xml:space="preserve"> uji dengan lansia dan review tenaga kesehatan sebelum pilot. Pemeriksaan keselamatan memakai aturan deterministik, bukan sekadar penilaian LLM (Tabel V).</w:t>
       </w:r>
     </w:p>
     <w:p>
@@ -4609,7 +4569,7 @@
         <w:pStyle w:val="BodyText"/>
       </w:pPr>
       <w:r>
-        <w:t>Gambar 7 menunjukkan tahapan pengembangan. Setelah lomba, langkah kami adalah meminta tenaga kesehatan mereview aturan klinis, menguji kegunaan bersama 5-10 lansia dengan persetujuan tertulis, lalu mengajak jejaring Code Stroke di Gunungkidul untuk pilot dalam kerangka sandbox. Indikator pilotnya adalah onset-to-arrival time, persentase pasien yang tiba dalam golden period, RPPT, dan frekuensi telepon keluarga.</w:t>
+        <w:t>Gambar 7 menunjukkan lima fase project. Fase 1 sampai 3 dikerjakan tim, fase 4 dan 5 bersama mitra. Setelah prototipe berjalan, langkah kami adalah meminta tenaga kesehatan mereview aturan klinis, menguji kegunaan bersama 5-10 lansia dengan persetujuan tertulis, lalu mengajak jejaring Code Stroke di Gunungkidul untuk pilot dalam kerangka sandbox. Indikator pilotnya adalah onset-to-arrival time, persentase pasien yang tiba dalam golden period, RPPT, dan frekuensi telepon keluarga.</w:t>
       </w:r>
     </w:p>
     <w:tbl>
@@ -4651,7 +4611,7 @@
             <w:r>
               <w:drawing>
                 <wp:inline xmlns:a="http://schemas.openxmlformats.org/drawingml/2006/main" xmlns:pic="http://schemas.openxmlformats.org/drawingml/2006/picture">
-                  <wp:extent cx="6176018" cy="1369906"/>
+                  <wp:extent cx="6176018" cy="1434702"/>
                   <wp:docPr id="7" name="Picture 7"/>
                   <wp:cNvGraphicFramePr>
                     <a:graphicFrameLocks noChangeAspect="1"/>
@@ -4672,7 +4632,7 @@
                         <pic:spPr>
                           <a:xfrm>
                             <a:off x="0" y="0"/>
-                            <a:ext cx="6176018" cy="1369906"/>
+                            <a:ext cx="6176018" cy="1434702"/>
                           </a:xfrm>
                           <a:prstGeom prst="rect"/>
                         </pic:spPr>
@@ -4689,7 +4649,7 @@
               <w:spacing w:after="80"/>
             </w:pPr>
             <w:r>
-              <w:t>Roadmap TILIK.</w:t>
+              <w:t>Roadmap TILIK dalam lima fase project. Fase 4 dan 5 (abu-abu) membutuhkan mitra.</w:t>
             </w:r>
           </w:p>
         </w:tc>

</xml_diff>